<commit_message>
Clean up of WP
</commit_message>
<xml_diff>
--- a/IPBES_WP_OpenAlex.docx
+++ b/IPBES_WP_OpenAlex.docx
@@ -7,55 +7,7 @@
         <w:pStyle w:val="Title"/>
       </w:pPr>
       <w:r>
-        <w:t xml:space="preserve">OpenAlex</w:t>
-      </w:r>
-      <w:r>
-        <w:t xml:space="preserve"> </w:t>
-      </w:r>
-      <w:r>
-        <w:t xml:space="preserve">as</w:t>
-      </w:r>
-      <w:r>
-        <w:t xml:space="preserve"> </w:t>
-      </w:r>
-      <w:r>
-        <w:t xml:space="preserve">the</w:t>
-      </w:r>
-      <w:r>
-        <w:t xml:space="preserve"> </w:t>
-      </w:r>
-      <w:r>
-        <w:t xml:space="preserve">Literature</w:t>
-      </w:r>
-      <w:r>
-        <w:t xml:space="preserve"> </w:t>
-      </w:r>
-      <w:r>
-        <w:t xml:space="preserve">Database</w:t>
-      </w:r>
-      <w:r>
-        <w:t xml:space="preserve"> </w:t>
-      </w:r>
-      <w:r>
-        <w:t xml:space="preserve">of</w:t>
-      </w:r>
-      <w:r>
-        <w:t xml:space="preserve"> </w:t>
-      </w:r>
-      <w:r>
-        <w:t xml:space="preserve">Choice</w:t>
-      </w:r>
-      <w:r>
-        <w:t xml:space="preserve"> </w:t>
-      </w:r>
-      <w:r>
-        <w:t xml:space="preserve">of</w:t>
-      </w:r>
-      <w:r>
-        <w:t xml:space="preserve"> </w:t>
-      </w:r>
-      <w:r>
-        <w:t xml:space="preserve">IPBES</w:t>
+        <w:t xml:space="preserve">OpenAlex as the Literature Database of Choice of IPBES</w:t>
       </w:r>
     </w:p>
     <w:p>
@@ -63,13 +15,7 @@
         <w:pStyle w:val="Subtitle"/>
       </w:pPr>
       <w:r>
-        <w:t xml:space="preserve">White</w:t>
-      </w:r>
-      <w:r>
-        <w:t xml:space="preserve"> </w:t>
-      </w:r>
-      <w:r>
-        <w:t xml:space="preserve">Paper</w:t>
+        <w:t xml:space="preserve">White Paper</w:t>
       </w:r>
     </w:p>
     <w:p>
@@ -77,19 +23,7 @@
         <w:pStyle w:val="Author"/>
       </w:pPr>
       <w:r>
-        <w:t xml:space="preserve">Rainer</w:t>
-      </w:r>
-      <w:r>
-        <w:t xml:space="preserve"> </w:t>
-      </w:r>
-      <w:r>
-        <w:t xml:space="preserve">M</w:t>
-      </w:r>
-      <w:r>
-        <w:t xml:space="preserve"> </w:t>
-      </w:r>
-      <w:r>
-        <w:t xml:space="preserve">Krug</w:t>
+        <w:t xml:space="preserve">Rainer M Krug</w:t>
       </w:r>
     </w:p>
     <w:p>
@@ -97,7 +31,7 @@
         <w:pStyle w:val="Date"/>
       </w:pPr>
       <w:r>
-        <w:t xml:space="preserve">2024-10-09</w:t>
+        <w:t xml:space="preserve">2025-02-24</w:t>
       </w:r>
     </w:p>
     <w:p>
@@ -183,7 +117,7 @@
         <w:pStyle w:val="FirstParagraph"/>
       </w:pPr>
       <w:r>
-        <w:t xml:space="preserve">This white paper will look at the suitability of OpenAlex as a recommended data source for IPBES assessments of scholary literature in contrast to for example</w:t>
+        <w:t xml:space="preserve">This white paper evaluates</w:t>
       </w:r>
       <w:r>
         <w:t xml:space="preserve"> </w:t>
@@ -193,6 +127,23 @@
           <w:rPr>
             <w:rStyle w:val="Hyperlink"/>
           </w:rPr>
+          <w:t xml:space="preserve">OpenAlex</w:t>
+        </w:r>
+      </w:hyperlink>
+      <w:r>
+        <w:t xml:space="preserve"> </w:t>
+      </w:r>
+      <w:r>
+        <w:t xml:space="preserve">as a recommended data source for IPBES assessments of scholarly literature, compared to</w:t>
+      </w:r>
+      <w:r>
+        <w:t xml:space="preserve"> </w:t>
+      </w:r>
+      <w:hyperlink r:id="rId23">
+        <w:r>
+          <w:rPr>
+            <w:rStyle w:val="Hyperlink"/>
+          </w:rPr>
           <w:t xml:space="preserve">Web of Science</w:t>
         </w:r>
       </w:hyperlink>
@@ -205,16 +156,137 @@
       <w:r>
         <w:t xml:space="preserve"> </w:t>
       </w:r>
+      <w:hyperlink r:id="rId24">
+        <w:r>
+          <w:rPr>
+            <w:rStyle w:val="Hyperlink"/>
+          </w:rPr>
+          <w:t xml:space="preserve">Scopus</w:t>
+        </w:r>
+      </w:hyperlink>
+      <w:r>
+        <w:t xml:space="preserve">. The focus is on its use within IPBES, emphasizing the transparency of academic literature searches.</w:t>
+      </w:r>
+    </w:p>
+    <w:p>
+      <w:pPr>
+        <w:pStyle w:val="BodyText"/>
+      </w:pPr>
+      <w:r>
+        <w:t xml:space="preserve">In IPBES assessments, the main sources for scholary literature search were</w:t>
+      </w:r>
+      <w:r>
+        <w:t xml:space="preserve"> </w:t>
+      </w:r>
       <w:hyperlink r:id="rId23">
         <w:r>
           <w:rPr>
             <w:rStyle w:val="Hyperlink"/>
           </w:rPr>
+          <w:t xml:space="preserve">Web of Science</w:t>
+        </w:r>
+      </w:hyperlink>
+      <w:r>
+        <w:t xml:space="preserve"> </w:t>
+      </w:r>
+      <w:r>
+        <w:t xml:space="preserve">and</w:t>
+      </w:r>
+      <w:r>
+        <w:t xml:space="preserve"> </w:t>
+      </w:r>
+      <w:hyperlink r:id="rId24">
+        <w:r>
+          <w:rPr>
+            <w:rStyle w:val="Hyperlink"/>
+          </w:rPr>
           <w:t xml:space="preserve">Scopus</w:t>
         </w:r>
       </w:hyperlink>
       <w:r>
-        <w:t xml:space="preserve">. The scope only concerns the use within IPBES nd the main focus is on the transparency of the literature search for academic literature.</w:t>
+        <w:t xml:space="preserve">. These were mainly used via the web interface due to licensing limitations and complexities in the</w:t>
+      </w:r>
+      <w:r>
+        <w:t xml:space="preserve"> </w:t>
+      </w:r>
+      <w:hyperlink w:anchor="glossary-api">
+        <w:r>
+          <w:rPr>
+            <w:rStyle w:val="Hyperlink"/>
+          </w:rPr>
+          <w:t xml:space="preserve">API</w:t>
+        </w:r>
+      </w:hyperlink>
+      <w:r>
+        <w:t xml:space="preserve">. The use of the web interface poses a considerable problem regarding transparency and reproducibility of the search. In addition, neither the data used of these scholary data sources nor the code which is used to conduct the search or the</w:t>
+      </w:r>
+      <w:r>
+        <w:t xml:space="preserve"> </w:t>
+      </w:r>
+      <w:hyperlink w:anchor="glossary-api">
+        <w:r>
+          <w:rPr>
+            <w:rStyle w:val="Hyperlink"/>
+          </w:rPr>
+          <w:t xml:space="preserve">API</w:t>
+        </w:r>
+      </w:hyperlink>
+      <w:r>
+        <w:t xml:space="preserve"> </w:t>
+      </w:r>
+      <w:r>
+        <w:t xml:space="preserve">implementation is openly availabe. As literature forms the foundation of most aspects in IPBES assessments, this lack of transparency filters through to the final product.</w:t>
+      </w:r>
+      <w:r>
+        <w:t xml:space="preserve"> </w:t>
+      </w:r>
+      <w:r>
+        <w:t xml:space="preserve">The Data and Knowledge Management Policy (https://www.ipbes.net/node/38260 and https://zenodo.org/records/6243095) aims to enhance the transparency of IPBES products. An option to the replace the proprietary scholarly data sources is</w:t>
+      </w:r>
+      <w:r>
+        <w:t xml:space="preserve"> </w:t>
+      </w:r>
+      <w:hyperlink r:id="rId22">
+        <w:r>
+          <w:rPr>
+            <w:rStyle w:val="Hyperlink"/>
+          </w:rPr>
+          <w:t xml:space="preserve">OpenAlex</w:t>
+        </w:r>
+      </w:hyperlink>
+      <w:r>
+        <w:t xml:space="preserve">. Unlike the proprietary and restricted scholarly data sources,</w:t>
+      </w:r>
+      <w:r>
+        <w:t xml:space="preserve"> </w:t>
+      </w:r>
+      <w:hyperlink r:id="rId22">
+        <w:r>
+          <w:rPr>
+            <w:rStyle w:val="Hyperlink"/>
+          </w:rPr>
+          <w:t xml:space="preserve">OpenAlex</w:t>
+        </w:r>
+      </w:hyperlink>
+      <w:r>
+        <w:t xml:space="preserve"> </w:t>
+      </w:r>
+      <w:r>
+        <w:t xml:space="preserve">is open, free to use, and both the data and code are openly accessible under the</w:t>
+      </w:r>
+      <w:r>
+        <w:t xml:space="preserve"> </w:t>
+      </w:r>
+      <w:hyperlink r:id="rId25">
+        <w:r>
+          <w:rPr>
+            <w:rStyle w:val="Hyperlink"/>
+          </w:rPr>
+          <w:t xml:space="preserve">CC0 license</w:t>
+        </w:r>
+      </w:hyperlink>
+      <w:r>
+        <w:t xml:space="preserve">.</w:t>
       </w:r>
     </w:p>
     <w:p>
@@ -222,69 +294,7 @@
         <w:pStyle w:val="BodyText"/>
       </w:pPr>
       <w:r>
-        <w:t xml:space="preserve">In IPBES assessments, the main sources for scholary literature search were</w:t>
-      </w:r>
-      <w:r>
-        <w:t xml:space="preserve"> </w:t>
-      </w:r>
-      <w:hyperlink r:id="rId22">
-        <w:r>
-          <w:rPr>
-            <w:rStyle w:val="Hyperlink"/>
-          </w:rPr>
-          <w:t xml:space="preserve">Web of Science</w:t>
-        </w:r>
-      </w:hyperlink>
-      <w:r>
-        <w:t xml:space="preserve"> </w:t>
-      </w:r>
-      <w:r>
-        <w:t xml:space="preserve">and</w:t>
-      </w:r>
-      <w:r>
-        <w:t xml:space="preserve"> </w:t>
-      </w:r>
-      <w:hyperlink r:id="rId23">
-        <w:r>
-          <w:rPr>
-            <w:rStyle w:val="Hyperlink"/>
-          </w:rPr>
-          <w:t xml:space="preserve">Scopus</w:t>
-        </w:r>
-      </w:hyperlink>
-      <w:r>
-        <w:t xml:space="preserve">. These were mainly used via the web interface due to licensing limitations and complexities in the</w:t>
-      </w:r>
-      <w:r>
-        <w:t xml:space="preserve"> </w:t>
-      </w:r>
-      <w:hyperlink w:anchor="glossary-api">
-        <w:r>
-          <w:rPr>
-            <w:rStyle w:val="Hyperlink"/>
-          </w:rPr>
-          <w:t xml:space="preserve">API</w:t>
-        </w:r>
-      </w:hyperlink>
-      <w:r>
-        <w:t xml:space="preserve">. The use of the web interface poses a huge problem regarding the transparency and the reproducibility of the search. In addition, neither the data used of these scholary data sources nor the code which is used to conduct the search or the</w:t>
-      </w:r>
-      <w:r>
-        <w:t xml:space="preserve"> </w:t>
-      </w:r>
-      <w:hyperlink w:anchor="glossary-api">
-        <w:r>
-          <w:rPr>
-            <w:rStyle w:val="Hyperlink"/>
-          </w:rPr>
-          <w:t xml:space="preserve">API</w:t>
-        </w:r>
-      </w:hyperlink>
-      <w:r>
-        <w:t xml:space="preserve"> </w:t>
-      </w:r>
-      <w:r>
-        <w:t xml:space="preserve">implementation is openly availabe. As the literature search forms the foundation of many aspects in IPBES assessments, this lack of transparency filters through to the final product.</w:t>
+        <w:t xml:space="preserve">The data tsu therefore decided to assess the suitability of OpenAlex as a replacement for the proprietary scholary data sources in the context of IPBES, with particular focus on the needs of the assessments. Based on this initial assessment and the initial usage in assessments, we recommend the usage of OpenAlex instead of proprietary scholary data sources.</w:t>
       </w:r>
     </w:p>
     <w:p>
@@ -292,51 +302,7 @@
         <w:pStyle w:val="BodyText"/>
       </w:pPr>
       <w:r>
-        <w:t xml:space="preserve">The Data and Knowledge Management Policy (https://www.ipbes.net/node/38260 and https://zenodo.org/records/6243095) has the as one objective the improvement of the transparency of IPBES products. One alternative to these proprietary scholary data sources is</w:t>
-      </w:r>
-      <w:r>
-        <w:t xml:space="preserve"> </w:t>
-      </w:r>
-      <w:hyperlink r:id="rId24">
-        <w:r>
-          <w:rPr>
-            <w:rStyle w:val="Hyperlink"/>
-          </w:rPr>
-          <w:t xml:space="preserve">OpenAlex</w:t>
-        </w:r>
-      </w:hyperlink>
-      <w:r>
-        <w:t xml:space="preserve">. In comparison to the proprietory and closed scholary data sources, OpenAlex is open and free to use and the data and code used is openly available, licensed under the</w:t>
-      </w:r>
-      <w:r>
-        <w:t xml:space="preserve"> </w:t>
-      </w:r>
-      <w:hyperlink r:id="rId25">
-        <w:r>
-          <w:rPr>
-            <w:rStyle w:val="Hyperlink"/>
-          </w:rPr>
-          <w:t xml:space="preserve">CC0 license</w:t>
-        </w:r>
-      </w:hyperlink>
-      <w:r>
-        <w:t xml:space="preserve">.</w:t>
-      </w:r>
-    </w:p>
-    <w:p>
-      <w:pPr>
-        <w:pStyle w:val="BodyText"/>
-      </w:pPr>
-      <w:r>
-        <w:t xml:space="preserve">The data tsu therefore decided to assess the suitability of OpenAlex as a replacement for the proprietary scholary data sources in the context of IPBES, with particular focus on the needs of the assessments. Based on this initial assessment and the initial usage in assessments, we recommend the usage of OpenAlex instead of proprietary scholary data sources.</w:t>
-      </w:r>
-    </w:p>
-    <w:p>
-      <w:pPr>
-        <w:pStyle w:val="BodyText"/>
-      </w:pPr>
-      <w:r>
-        <w:t xml:space="preserve">This document will detail differences between the sholary data sources and outline the advantages of OpenAlex over WoS and Scopus.</w:t>
+        <w:t xml:space="preserve">This document will detail differences between these sholary data sources and outline the advantages of OpenAlex over WoS and Scopus.</w:t>
       </w:r>
     </w:p>
     <w:bookmarkEnd w:id="26"/>
@@ -366,7 +332,7 @@
         </w:numPr>
       </w:pPr>
       <w:r>
-        <w:t xml:space="preserve">Available works and number of OpenAccess works</w:t>
+        <w:t xml:space="preserve">Number of works in the dta source and number of OpenAccess works</w:t>
       </w:r>
     </w:p>
     <w:p>
@@ -556,7 +522,6 @@
           <w:p>
             <w:pPr>
               <w:pStyle w:val="Compact"/>
-              <w:jc w:val="left"/>
             </w:pPr>
             <w:r>
               <w:t xml:space="preserve">Number of works</w:t>
@@ -568,7 +533,6 @@
           <w:p>
             <w:pPr>
               <w:pStyle w:val="Compact"/>
-              <w:jc w:val="left"/>
             </w:pPr>
             <w:r>
               <w:t xml:space="preserve">Open Access Works</w:t>
@@ -580,7 +544,6 @@
           <w:p>
             <w:pPr>
               <w:pStyle w:val="Compact"/>
-              <w:jc w:val="left"/>
             </w:pPr>
             <w:r>
               <w:t xml:space="preserve">Citations</w:t>
@@ -592,7 +555,6 @@
           <w:p>
             <w:pPr>
               <w:pStyle w:val="Compact"/>
-              <w:jc w:val="left"/>
             </w:pPr>
             <w:r>
               <w:t xml:space="preserve">Price</w:t>
@@ -604,7 +566,6 @@
           <w:p>
             <w:pPr>
               <w:pStyle w:val="Compact"/>
-              <w:jc w:val="left"/>
             </w:pPr>
             <w:r>
               <w:t xml:space="preserve">Data Openness</w:t>
@@ -616,7 +577,6 @@
           <w:p>
             <w:pPr>
               <w:pStyle w:val="Compact"/>
-              <w:jc w:val="left"/>
             </w:pPr>
             <w:r>
               <w:t xml:space="preserve">Org Structure</w:t>
@@ -630,7 +590,6 @@
           <w:p>
             <w:pPr>
               <w:pStyle w:val="Compact"/>
-              <w:jc w:val="left"/>
             </w:pPr>
             <w:r>
               <w:t xml:space="preserve">OpenAlex</w:t>
@@ -642,7 +601,6 @@
           <w:p>
             <w:pPr>
               <w:pStyle w:val="Compact"/>
-              <w:jc w:val="left"/>
             </w:pPr>
             <w:r>
               <w:t xml:space="preserve">243M</w:t>
@@ -654,7 +612,6 @@
           <w:p>
             <w:pPr>
               <w:pStyle w:val="Compact"/>
-              <w:jc w:val="left"/>
             </w:pPr>
             <w:r>
               <w:t xml:space="preserve">48M</w:t>
@@ -666,7 +623,6 @@
           <w:p>
             <w:pPr>
               <w:pStyle w:val="Compact"/>
-              <w:jc w:val="left"/>
             </w:pPr>
             <w:r>
               <w:t xml:space="preserve">1.9B</w:t>
@@ -678,7 +634,6 @@
           <w:p>
             <w:pPr>
               <w:pStyle w:val="Compact"/>
-              <w:jc w:val="left"/>
             </w:pPr>
             <w:r>
               <w:t xml:space="preserve">Freemium</w:t>
@@ -690,7 +645,6 @@
           <w:p>
             <w:pPr>
               <w:pStyle w:val="Compact"/>
-              <w:jc w:val="left"/>
             </w:pPr>
             <w:r>
               <w:t xml:space="preserve">Fully open, CC0 license</w:t>
@@ -702,7 +656,6 @@
           <w:p>
             <w:pPr>
               <w:pStyle w:val="Compact"/>
-              <w:jc w:val="left"/>
             </w:pPr>
             <w:r>
               <w:t xml:space="preserve">Non-profit</w:t>
@@ -716,7 +669,6 @@
           <w:p>
             <w:pPr>
               <w:pStyle w:val="Compact"/>
-              <w:jc w:val="left"/>
             </w:pPr>
             <w:r>
               <w:t xml:space="preserve">Scopus</w:t>
@@ -728,7 +680,6 @@
           <w:p>
             <w:pPr>
               <w:pStyle w:val="Compact"/>
-              <w:jc w:val="left"/>
             </w:pPr>
             <w:r>
               <w:t xml:space="preserve">87M</w:t>
@@ -740,7 +691,6 @@
           <w:p>
             <w:pPr>
               <w:pStyle w:val="Compact"/>
-              <w:jc w:val="left"/>
             </w:pPr>
             <w:r>
               <w:t xml:space="preserve">20.5M (ref)</w:t>
@@ -752,7 +702,6 @@
           <w:p>
             <w:pPr>
               <w:pStyle w:val="Compact"/>
-              <w:jc w:val="left"/>
             </w:pPr>
             <w:r>
               <w:t xml:space="preserve">1.8B</w:t>
@@ -764,7 +713,6 @@
           <w:p>
             <w:pPr>
               <w:pStyle w:val="Compact"/>
-              <w:jc w:val="left"/>
             </w:pPr>
             <w:r>
               <w:t xml:space="preserve">Subscription</w:t>
@@ -776,7 +724,6 @@
           <w:p>
             <w:pPr>
               <w:pStyle w:val="Compact"/>
-              <w:jc w:val="left"/>
             </w:pPr>
             <w:r>
               <w:t xml:space="preserve">Closed</w:t>
@@ -788,7 +735,6 @@
           <w:p>
             <w:pPr>
               <w:pStyle w:val="Compact"/>
-              <w:jc w:val="left"/>
             </w:pPr>
             <w:r>
               <w:t xml:space="preserve">For Profit</w:t>
@@ -802,7 +748,6 @@
           <w:p>
             <w:pPr>
               <w:pStyle w:val="Compact"/>
-              <w:jc w:val="left"/>
             </w:pPr>
             <w:r>
               <w:t xml:space="preserve">Web of Science (core)</w:t>
@@ -814,7 +759,6 @@
           <w:p>
             <w:pPr>
               <w:pStyle w:val="Compact"/>
-              <w:jc w:val="left"/>
             </w:pPr>
             <w:r>
               <w:t xml:space="preserve">87M (ref)</w:t>
@@ -826,7 +770,6 @@
           <w:p>
             <w:pPr>
               <w:pStyle w:val="Compact"/>
-              <w:jc w:val="left"/>
             </w:pPr>
             <w:r>
               <w:t xml:space="preserve">12M (ref)</w:t>
@@ -838,7 +781,6 @@
           <w:p>
             <w:pPr>
               <w:pStyle w:val="Compact"/>
-              <w:jc w:val="left"/>
             </w:pPr>
             <w:r>
               <w:t xml:space="preserve">1.8B</w:t>
@@ -850,7 +792,6 @@
           <w:p>
             <w:pPr>
               <w:pStyle w:val="Compact"/>
-              <w:jc w:val="left"/>
             </w:pPr>
             <w:r>
               <w:t xml:space="preserve">Subscription</w:t>
@@ -862,7 +803,6 @@
           <w:p>
             <w:pPr>
               <w:pStyle w:val="Compact"/>
-              <w:jc w:val="left"/>
             </w:pPr>
             <w:r>
               <w:t xml:space="preserve">Closed</w:t>
@@ -874,7 +814,6 @@
           <w:p>
             <w:pPr>
               <w:pStyle w:val="Compact"/>
-              <w:jc w:val="left"/>
             </w:pPr>
             <w:r>
               <w:t xml:space="preserve">For Profit</w:t>
@@ -888,7 +827,6 @@
           <w:p>
             <w:pPr>
               <w:pStyle w:val="Compact"/>
-              <w:jc w:val="left"/>
             </w:pPr>
             <w:r>
               <w:t xml:space="preserve">Dimensions</w:t>
@@ -900,7 +838,6 @@
           <w:p>
             <w:pPr>
               <w:pStyle w:val="Compact"/>
-              <w:jc w:val="left"/>
             </w:pPr>
             <w:r>
               <w:t xml:space="preserve">135M</w:t>
@@ -912,7 +849,6 @@
           <w:p>
             <w:pPr>
               <w:pStyle w:val="Compact"/>
-              <w:jc w:val="left"/>
             </w:pPr>
             <w:r>
               <w:t xml:space="preserve">29M (ref)</w:t>
@@ -924,7 +860,6 @@
           <w:p>
             <w:pPr>
               <w:pStyle w:val="Compact"/>
-              <w:jc w:val="left"/>
             </w:pPr>
             <w:r>
               <w:t xml:space="preserve">1.7B</w:t>
@@ -936,7 +871,6 @@
           <w:p>
             <w:pPr>
               <w:pStyle w:val="Compact"/>
-              <w:jc w:val="left"/>
             </w:pPr>
             <w:r>
               <w:t xml:space="preserve">Freemium</w:t>
@@ -948,7 +882,6 @@
           <w:p>
             <w:pPr>
               <w:pStyle w:val="Compact"/>
-              <w:jc w:val="left"/>
             </w:pPr>
             <w:r>
               <w:t xml:space="preserve">Partly open, personal use</w:t>
@@ -960,7 +893,6 @@
           <w:p>
             <w:pPr>
               <w:pStyle w:val="Compact"/>
-              <w:jc w:val="left"/>
             </w:pPr>
             <w:r>
               <w:t xml:space="preserve">For Profit</w:t>
@@ -974,7 +906,6 @@
           <w:p>
             <w:pPr>
               <w:pStyle w:val="Compact"/>
-              <w:jc w:val="left"/>
             </w:pPr>
             <w:r>
               <w:t xml:space="preserve">Google Scholar</w:t>
@@ -986,7 +917,6 @@
           <w:p>
             <w:pPr>
               <w:pStyle w:val="Compact"/>
-              <w:jc w:val="left"/>
             </w:pPr>
             <w:r>
               <w:t xml:space="preserve">389M (estimated)</w:t>
@@ -998,7 +928,6 @@
           <w:p>
             <w:pPr>
               <w:pStyle w:val="Compact"/>
-              <w:jc w:val="left"/>
             </w:pPr>
             <w:r>
               <w:t xml:space="preserve">?</w:t>
@@ -1010,7 +939,6 @@
           <w:p>
             <w:pPr>
               <w:pStyle w:val="Compact"/>
-              <w:jc w:val="left"/>
             </w:pPr>
             <w:r>
               <w:t xml:space="preserve">?</w:t>
@@ -1022,7 +950,6 @@
           <w:p>
             <w:pPr>
               <w:pStyle w:val="Compact"/>
-              <w:jc w:val="left"/>
             </w:pPr>
             <w:r>
               <w:t xml:space="preserve">Free</w:t>
@@ -1034,7 +961,6 @@
           <w:p>
             <w:pPr>
               <w:pStyle w:val="Compact"/>
-              <w:jc w:val="left"/>
             </w:pPr>
             <w:r>
               <w:t xml:space="preserve">Closed</w:t>
@@ -1046,7 +972,6 @@
           <w:p>
             <w:pPr>
               <w:pStyle w:val="Compact"/>
-              <w:jc w:val="left"/>
             </w:pPr>
             <w:r>
               <w:t xml:space="preserve">For Profit</w:t>
@@ -1060,7 +985,6 @@
           <w:p>
             <w:pPr>
               <w:pStyle w:val="Compact"/>
-              <w:jc w:val="left"/>
             </w:pPr>
             <w:r>
               <w:t xml:space="preserve">Crossref</w:t>
@@ -1072,7 +996,6 @@
           <w:p>
             <w:pPr>
               <w:pStyle w:val="Compact"/>
-              <w:jc w:val="left"/>
             </w:pPr>
             <w:r>
               <w:t xml:space="preserve">145M</w:t>
@@ -1084,7 +1007,6 @@
           <w:p>
             <w:pPr>
               <w:pStyle w:val="Compact"/>
-              <w:jc w:val="left"/>
             </w:pPr>
             <w:r>
               <w:t xml:space="preserve">20M</w:t>
@@ -1096,7 +1018,6 @@
           <w:p>
             <w:pPr>
               <w:pStyle w:val="Compact"/>
-              <w:jc w:val="left"/>
             </w:pPr>
             <w:r>
               <w:t xml:space="preserve">1.45B</w:t>
@@ -1108,7 +1029,6 @@
           <w:p>
             <w:pPr>
               <w:pStyle w:val="Compact"/>
-              <w:jc w:val="left"/>
             </w:pPr>
             <w:r>
               <w:t xml:space="preserve">Free</w:t>
@@ -1120,7 +1040,6 @@
           <w:p>
             <w:pPr>
               <w:pStyle w:val="Compact"/>
-              <w:jc w:val="left"/>
             </w:pPr>
             <w:r>
               <w:t xml:space="preserve">Fully open, CC0 license</w:t>
@@ -1132,7 +1051,6 @@
           <w:p>
             <w:pPr>
               <w:pStyle w:val="Compact"/>
-              <w:jc w:val="left"/>
             </w:pPr>
             <w:r>
               <w:t xml:space="preserve">Non-profit</w:t>
@@ -1413,7 +1331,7 @@
         <w:t xml:space="preserve"> </w:t>
       </w:r>
       <w:r>
-        <w:t xml:space="preserve">access is important for accessing the database programmatically. An example is a search for all articles covering a specific topic. Usually, this is an iterative provess which needs refinement of the search terms. The traditional way is to type the search term in the search box and at least write down the number of hits, change the search term and repeat the process. Especially when other comparisons should also be done (e.g. assessment of certain key-papers are in the search results), this becomes a very tedious and error prone process.</w:t>
+        <w:t xml:space="preserve">access is important for accessing the database programmatically. An example is a search for all articles covering a specific topic. Usually, this is an iterative provess which needs refinement of the search terms. The traditional way is to type the search term in the search box and and write down at least the number of hits, change the search term and repeat the process. Especially when other comparisons should also be done (e.g. assessment of certain key-papers are in the search results), this becomes a very tedious and error prone process.</w:t>
       </w:r>
     </w:p>
     <w:p>
@@ -1445,11 +1363,15 @@
       <w:r>
         <w:t xml:space="preserve">Nevertheless, web acces to conduct manual searches is a valuable tool to conduct initial testing of search terms.</w:t>
       </w:r>
-    </w:p>
-    <w:p>
-      <w:pPr>
-        <w:pStyle w:val="BodyText"/>
-      </w:pPr>
+      <w:r>
+        <w:t xml:space="preserve"> </w:t>
+      </w:r>
+      <w:r>
+        <w:t xml:space="preserve">render</w:t>
+      </w:r>
+      <w:r>
+        <w:t xml:space="preserve"> </w:t>
+      </w:r>
       <w:r>
         <w:t xml:space="preserve">OpenAlex has, as all of the other other scholary data sources, a</w:t>
       </w:r>
@@ -1657,7 +1579,7 @@
         <w:t xml:space="preserve"> </w:t>
       </w:r>
       <w:r>
-        <w:t xml:space="preserve">calls per day with a maximum of 10 per second) is not enaough, a Premium subscription can be obtained (the tsu has obtained a Premium license free of charge due to extensive feed back and extensive discussions with OpenAlex). The pricing is determined on a case by case basis.</w:t>
+        <w:t xml:space="preserve">calls per day with a maximum of 10 per second) is not enough, a Premium subscription can be obtained (the tsu has obtained a Premium license free of charge due to extensive feed back and extensive discussions with OpenAlex). The pricing is determined on a case by case basis.</w:t>
       </w:r>
     </w:p>
     <w:p>
@@ -1665,7 +1587,7 @@
         <w:pStyle w:val="BodyText"/>
       </w:pPr>
       <w:r>
-        <w:t xml:space="preserve">For nearly all usage scenarios within IPBES, the free tier is more than enough, and the remaining usage scenarios are still possible but require longer running times of the search, or can utilise a</w:t>
+        <w:t xml:space="preserve">For nearly all usage scenarios within IPBES, the free tier is more than enough, and the remaining usage scenarios are still possible but require longer, or can utilise a</w:t>
       </w:r>
       <w:r>
         <w:t xml:space="preserve"> </w:t>
@@ -1704,7 +1626,7 @@
         <w:t xml:space="preserve"> </w:t>
       </w:r>
       <w:r>
-        <w:t xml:space="preserve">costs for WoS can easily go intu 10s of thousands per dollars per year, and if a</w:t>
+        <w:t xml:space="preserve">costs for WoS can easily go into 10s of thousands per dollars per year, and if a</w:t>
       </w:r>
       <w:r>
         <w:t xml:space="preserve"> </w:t>
@@ -1721,7 +1643,24 @@
         <w:t xml:space="preserve"> </w:t>
       </w:r>
       <w:r>
-        <w:t xml:space="preserve">is required even in the millions. In addition, none of the offered smaller API {#glossary-api} licenses covers the needs of IPBES, i.e. download of diverse metadata as well as download of a large nuber of works.</w:t>
+        <w:t xml:space="preserve">is required even in the millions. In addition, none of the offered smaller</w:t>
+      </w:r>
+      <w:r>
+        <w:t xml:space="preserve"> </w:t>
+      </w:r>
+      <w:hyperlink w:anchor="glossary-api">
+        <w:r>
+          <w:rPr>
+            <w:rStyle w:val="Hyperlink"/>
+          </w:rPr>
+          <w:t xml:space="preserve">API</w:t>
+        </w:r>
+      </w:hyperlink>
+      <w:r>
+        <w:t xml:space="preserve"> </w:t>
+      </w:r>
+      <w:r>
+        <w:t xml:space="preserve">licenses covers the needs of IPBES, i.e. download of diverse metadata as well as download of a large nuber of works.</w:t>
       </w:r>
     </w:p>
     <w:bookmarkEnd w:id="46"/>
@@ -1748,17 +1687,17 @@
         <w:pStyle w:val="BodyText"/>
       </w:pPr>
       <w:r>
-        <w:t xml:space="preserve">To facilitate the switch, the following technical guidelines are in preparation to help the authors to use OpenAlex programmatically in their assessments</w:t>
-      </w:r>
-      <w:r>
-        <w:t xml:space="preserve"> </w:t>
-      </w:r>
-      <w:r>
-        <w:t xml:space="preserve">-</w:t>
-      </w:r>
-      <w:r>
-        <w:t xml:space="preserve"> </w:t>
-      </w:r>
+        <w:t xml:space="preserve">To facilitate the switch, the following technical guidelines are available and in preparation / planning to help the authors to use OpenAlex programmatically in their assessments</w:t>
+      </w:r>
+    </w:p>
+    <w:p>
+      <w:pPr>
+        <w:pStyle w:val="Compact"/>
+        <w:numPr>
+          <w:ilvl w:val="0"/>
+          <w:numId w:val="1003"/>
+        </w:numPr>
+      </w:pPr>
       <w:hyperlink r:id="rId48">
         <w:r>
           <w:rPr>
@@ -1773,17 +1712,17 @@
         <w:t xml:space="preserve"> </w:t>
       </w:r>
       <w:r>
-        <w:t xml:space="preserve">see other document</w:t>
-      </w:r>
-      <w:r>
-        <w:t xml:space="preserve"> </w:t>
-      </w:r>
-      <w:r>
-        <w:t xml:space="preserve">-</w:t>
-      </w:r>
-      <w:r>
-        <w:t xml:space="preserve"> </w:t>
-      </w:r>
+        <w:t xml:space="preserve">completed</w:t>
+      </w:r>
+    </w:p>
+    <w:p>
+      <w:pPr>
+        <w:pStyle w:val="Compact"/>
+        <w:numPr>
+          <w:ilvl w:val="0"/>
+          <w:numId w:val="1003"/>
+        </w:numPr>
+      </w:pPr>
       <w:r>
         <w:rPr>
           <w:b/>
@@ -1797,15 +1736,15 @@
       <w:r>
         <w:t xml:space="preserve">in planning</w:t>
       </w:r>
-      <w:r>
-        <w:t xml:space="preserve"> </w:t>
-      </w:r>
-      <w:r>
-        <w:t xml:space="preserve">-</w:t>
-      </w:r>
-      <w:r>
-        <w:t xml:space="preserve"> </w:t>
-      </w:r>
+    </w:p>
+    <w:p>
+      <w:pPr>
+        <w:pStyle w:val="Compact"/>
+        <w:numPr>
+          <w:ilvl w:val="0"/>
+          <w:numId w:val="1003"/>
+        </w:numPr>
+      </w:pPr>
       <w:r>
         <w:rPr>
           <w:b/>
@@ -2037,6 +1976,9 @@
     <w:abstractNumId w:val="991"/>
   </w:num>
   <w:num w:numId="1002">
+    <w:abstractNumId w:val="991"/>
+  </w:num>
+  <w:num w:numId="1003">
     <w:abstractNumId w:val="991"/>
   </w:num>
 </w:numbering>
@@ -2124,7 +2066,7 @@
   </w:style>
   <w:style w:styleId="Subtitle" w:type="paragraph">
     <w:name w:val="Subtitle"/>
-    <w:basedOn w:val="Normal"/>
+    <w:basedOn w:val="Title"/>
     <w:next w:val="BodyText"/>
     <w:link w:val="SubtitleChar"/>
     <w:uiPriority w:val="11"/>
@@ -2137,7 +2079,6 @@
     </w:pPr>
     <w:rPr>
       <w:rFonts w:cstheme="majorBidi" w:eastAsiaTheme="majorEastAsia"/>
-      <w:color w:themeColor="text1" w:themeTint="A6" w:val="595959"/>
       <w:spacing w:val="15"/>
       <w:sz w:val="28"/>
       <w:szCs w:val="28"/>
@@ -2190,7 +2131,6 @@
     </w:pPr>
     <w:rPr>
       <w:b/>
-      <w:color w:val="345A8A"/>
       <w:sz w:val="20"/>
       <w:szCs w:val="20"/>
     </w:rPr>

</xml_diff>

<commit_message>
Added Experiences with OpenAlex in IPBES
</commit_message>
<xml_diff>
--- a/IPBES_WP_OpenAlex.docx
+++ b/IPBES_WP_OpenAlex.docx
@@ -31,7 +31,7 @@
         <w:pStyle w:val="Date"/>
       </w:pPr>
       <w:r>
-        <w:t xml:space="preserve">2025-02-24</w:t>
+        <w:t xml:space="preserve">2025-03-05</w:t>
       </w:r>
     </w:p>
     <w:p>
@@ -1665,7 +1665,49 @@
     </w:p>
     <w:bookmarkEnd w:id="46"/>
     <w:bookmarkEnd w:id="47"/>
-    <w:bookmarkStart w:id="49" w:name="conclusion"/>
+    <w:bookmarkStart w:id="48" w:name="experience-using-openalex"/>
+    <w:p>
+      <w:pPr>
+        <w:pStyle w:val="Heading2"/>
+      </w:pPr>
+      <w:r>
+        <w:t xml:space="preserve">Experience using OpenAlex</w:t>
+      </w:r>
+    </w:p>
+    <w:p>
+      <w:pPr>
+        <w:pStyle w:val="FirstParagraph"/>
+      </w:pPr>
+      <w:r>
+        <w:t xml:space="preserve">OpenAlex was used in the Transformative Change Assessment to fulfil several requests from the experts. The use of OpenAlex was suggested by the d&amp;k tsu to the experts and the experts decided to use OpenAlex. The main reason was that the analysis and search they had planned would have been essentially not possible with scopus or WoS due to limitations of the GUI and non-availability (and limitations) of the APIs.</w:t>
+      </w:r>
+    </w:p>
+    <w:p>
+      <w:pPr>
+        <w:pStyle w:val="BodyText"/>
+      </w:pPr>
+      <w:r>
+        <w:t xml:space="preserve">OpenAlex enabled us to compile and download the Transformative Change Corpus (TCA Corpus), consisting of 4.5 million works. The works were downloaded, searches in the TCA Corpus were done for several aspects of the TCA and evidence was produced which was considered by the authors as very important to underline their research as well as show venues for additional focal points within the assessment as well as further research based on the assessment.</w:t>
+      </w:r>
+    </w:p>
+    <w:p>
+      <w:pPr>
+        <w:pStyle w:val="BodyText"/>
+      </w:pPr>
+      <w:r>
+        <w:t xml:space="preserve">OpenAlex also enabled us to do a second kind of search, i.e. a snowball search (following the citation graph from selected key papers one genertion back and one generation forward). This very focussed search is easily possible in OpenAlex via the API and the respective R package (openalexR), and has been used in the TCA as well as several times in the Business and Biodiversity Asserssment to obtain corpi of focussed literature to, im most cases, find additional evidence for certain points. It is also in usage for the Monitoring Assessment, which is at the moment conduting at least one snowball and one larger keyword search using OpenAlex.</w:t>
+      </w:r>
+    </w:p>
+    <w:p>
+      <w:pPr>
+        <w:pStyle w:val="BodyText"/>
+      </w:pPr>
+      <w:r>
+        <w:t xml:space="preserve">Overall, the experience with using OpenAlex within IPBES has been very positive and, as multiple requests from outside IPBES indicate, on the front of literature search methodologies in general.</w:t>
+      </w:r>
+    </w:p>
+    <w:bookmarkEnd w:id="48"/>
+    <w:bookmarkStart w:id="50" w:name="conclusion"/>
     <w:p>
       <w:pPr>
         <w:pStyle w:val="Heading2"/>
@@ -1698,7 +1740,7 @@
           <w:numId w:val="1003"/>
         </w:numPr>
       </w:pPr>
-      <w:hyperlink r:id="rId48">
+      <w:hyperlink r:id="rId49">
         <w:r>
           <w:rPr>
             <w:rStyle w:val="Hyperlink"/>
@@ -1759,7 +1801,7 @@
         <w:t xml:space="preserve">early planning stages</w:t>
       </w:r>
     </w:p>
-    <w:bookmarkEnd w:id="49"/>
+    <w:bookmarkEnd w:id="50"/>
     <w:sectPr/>
   </w:body>
 </w:document>

</xml_diff>